<commit_message>
docs: Ch1-Ch6 修訂 + Q7 新增 + 初稿IV 產出 + Turnitin 報告
- Ch1/Ch3: 六個→七個研究問題，新增 Q7（健檢時間點遠近與預測性能）
- Ch2: Majcherek AUC 標記「註2」、註2 文字精簡、九個→八個維度
- Ch4: 資料來源/篩選精簡、AUC-ROC 說明擴充、表 4-3 擴充為 10 項實驗含 Q 對應
- Ch5: 新增圖 5-1 模型分類架構
- Ch6: 策略 C → 策略 B 命名修正
- 新增初稿IV 產出檔案（docx/pdf/封面/浮水印）
- 新增 Turnitin 比對報告與使用手冊
- 新增 SCI 論文轉換計畫、class_weight 實驗結果圖

Co-Authored-By: Claude Opus 4.6 <noreply@anthropic.com>
</commit_message>
<xml_diff>
--- a/docs/00_thesis/chapters/04_第四章_研究設計.docx
+++ b/docs/00_thesis/chapters/04_第四章_研究設計.docx
@@ -545,27 +545,16 @@
         <w:rPr>
           <w:rFonts w:hint="eastAsia"/>
         </w:rPr>
-        <w:t xml:space="preserve">數位資料庫的縱貫性健康檢查資料集（Luo</w:t>
-      </w:r>
-      <w:r>
-        <w:t xml:space="preserve"> et al., </w:t>
-      </w:r>
-      <w:r>
-        <w:rPr>
-          <w:rFonts w:hint="eastAsia"/>
-        </w:rPr>
-        <w:t xml:space="preserve">2024）。</w:t>
-      </w:r>
-    </w:p>
-    <w:p>
-      <w:pPr>
-        <w:pStyle w:val="a0"/>
-      </w:pPr>
-      <w:r>
-        <w:rPr>
-          <w:rFonts w:hint="eastAsia"/>
-        </w:rPr>
-        <w:t xml:space="preserve">該資料集來自中國浙江省杭州市的社區健康調查，收集期間為</w:t>
+        <w:t xml:space="preserve">數位資料庫的縱貫性健康檢查資料集</w:t>
+      </w:r>
+      <w:r>
+        <w:t xml:space="preserve"> </w:t>
+      </w:r>
+      <w:r>
+        <w:rPr>
+          <w:rFonts w:hint="eastAsia"/>
+        </w:rPr>
+        <w:t xml:space="preserve">[18][19]。該資料集來自中國浙江省杭州市的社區健康調查，收集期間為</w:t>
       </w:r>
       <w:r>
         <w:t xml:space="preserve"> 2010 </w:t>
@@ -601,7 +590,16 @@
         <w:rPr>
           <w:rFonts w:hint="eastAsia"/>
         </w:rPr>
-        <w:t xml:space="preserve">人，多數參與者進行了</w:t>
+        <w:t xml:space="preserve">人、25,744</w:t>
+      </w:r>
+      <w:r>
+        <w:t xml:space="preserve"> </w:t>
+      </w:r>
+      <w:r>
+        <w:rPr>
+          <w:rFonts w:hint="eastAsia"/>
+        </w:rPr>
+        <w:t xml:space="preserve">筆健檢記錄，多數參與者進行了</w:t>
       </w:r>
       <w:r>
         <w:t xml:space="preserve"> 3 </w:t>
@@ -762,25 +760,7 @@
         <w:rPr>
           <w:rFonts w:hint="eastAsia"/>
         </w:rPr>
-        <w:t xml:space="preserve">原始資料集包含</w:t>
-      </w:r>
-      <w:r>
-        <w:t xml:space="preserve"> 6,119 </w:t>
-      </w:r>
-      <w:r>
-        <w:rPr>
-          <w:rFonts w:hint="eastAsia"/>
-        </w:rPr>
-        <w:t xml:space="preserve">位參與者共</w:t>
-      </w:r>
-      <w:r>
-        <w:t xml:space="preserve"> 25,744 </w:t>
-      </w:r>
-      <w:r>
-        <w:rPr>
-          <w:rFonts w:hint="eastAsia"/>
-        </w:rPr>
-        <w:t xml:space="preserve">筆健檢記錄。由於本研究採用三時間點縱貫設計（Y-2、Y-1、Y0），需要每位參與者至少有</w:t>
+        <w:t xml:space="preserve">原作者已篩選健檢次數</w:t>
       </w:r>
       <w:r>
         <w:t xml:space="preserve"> 3 </w:t>
@@ -789,7 +769,25 @@
         <w:rPr>
           <w:rFonts w:hint="eastAsia"/>
         </w:rPr>
-        <w:t xml:space="preserve">次健檢紀錄才能建構完整的特徵集與預測目標。</w:t>
+        <w:t xml:space="preserve">次以上之參與者，惟本研究驗證後發現仍有</w:t>
+      </w:r>
+      <w:r>
+        <w:t xml:space="preserve"> 63 </w:t>
+      </w:r>
+      <w:r>
+        <w:rPr>
+          <w:rFonts w:hint="eastAsia"/>
+        </w:rPr>
+        <w:t xml:space="preserve">人（1.03%）實際健檢紀錄不足</w:t>
+      </w:r>
+      <w:r>
+        <w:t xml:space="preserve"> 3 </w:t>
+      </w:r>
+      <w:r>
+        <w:rPr>
+          <w:rFonts w:hint="eastAsia"/>
+        </w:rPr>
+        <w:t xml:space="preserve">次，予以排除。</w:t>
       </w:r>
     </w:p>
     <w:p>
@@ -802,138 +800,25 @@
           <w:b/>
           <w:bCs/>
         </w:rPr>
-        <w:t xml:space="preserve">納入條件</w:t>
-      </w:r>
-      <w:r>
-        <w:rPr>
-          <w:rFonts w:hint="eastAsia"/>
-        </w:rPr>
-        <w:t xml:space="preserve">：</w:t>
+        <w:t xml:space="preserve">最終樣本數</w:t>
+      </w:r>
+      <w:r>
+        <w:rPr>
+          <w:rFonts w:hint="eastAsia"/>
+        </w:rPr>
+        <w:t xml:space="preserve">：6,056</w:t>
       </w:r>
       <w:r>
         <w:t xml:space="preserve"> </w:t>
       </w:r>
       <w:r>
-        <w:t xml:space="preserve">- </w:t>
-      </w:r>
-      <w:r>
-        <w:rPr>
-          <w:rFonts w:hint="eastAsia"/>
-        </w:rPr>
-        <w:t xml:space="preserve">至少有</w:t>
-      </w:r>
-      <w:r>
-        <w:t xml:space="preserve"> 3 </w:t>
-      </w:r>
-      <w:r>
-        <w:rPr>
-          <w:rFonts w:hint="eastAsia"/>
-        </w:rPr>
-        <w:t xml:space="preserve">次以上的連續健檢紀錄</w:t>
-      </w:r>
-      <w:r>
-        <w:t xml:space="preserve"> </w:t>
-      </w:r>
-      <w:r>
-        <w:t xml:space="preserve">- </w:t>
-      </w:r>
-      <w:r>
-        <w:rPr>
-          <w:rFonts w:hint="eastAsia"/>
-        </w:rPr>
-        <w:t xml:space="preserve">各時間點資料完整，無重大缺失</w:t>
-      </w:r>
-    </w:p>
-    <w:p>
-      <w:pPr>
-        <w:pStyle w:val="a0"/>
-      </w:pPr>
-      <w:r>
-        <w:rPr>
-          <w:rFonts w:hint="eastAsia"/>
-          <w:b/>
-          <w:bCs/>
-        </w:rPr>
-        <w:t xml:space="preserve">排除情況</w:t>
-      </w:r>
-      <w:r>
-        <w:rPr>
-          <w:rFonts w:hint="eastAsia"/>
-        </w:rPr>
-        <w:t xml:space="preserve">：</w:t>
-      </w:r>
-      <w:r>
-        <w:t xml:space="preserve"> </w:t>
-      </w:r>
-      <w:r>
-        <w:t xml:space="preserve">- </w:t>
-      </w:r>
-      <w:r>
-        <w:rPr>
-          <w:rFonts w:hint="eastAsia"/>
-        </w:rPr>
-        <w:t xml:space="preserve">共</w:t>
-      </w:r>
-      <w:r>
-        <w:t xml:space="preserve"> 63 </w:t>
-      </w:r>
-      <w:r>
-        <w:rPr>
-          <w:rFonts w:hint="eastAsia"/>
-        </w:rPr>
-        <w:t xml:space="preserve">人因僅有</w:t>
-      </w:r>
-      <w:r>
-        <w:t xml:space="preserve"> 1-2 </w:t>
-      </w:r>
-      <w:r>
-        <w:rPr>
-          <w:rFonts w:hint="eastAsia"/>
-        </w:rPr>
-        <w:t xml:space="preserve">次健檢紀錄而被排除</w:t>
-      </w:r>
-      <w:r>
-        <w:t xml:space="preserve"> </w:t>
-      </w:r>
-      <w:r>
-        <w:t xml:space="preserve">- </w:t>
-      </w:r>
-      <w:r>
-        <w:rPr>
-          <w:rFonts w:hint="eastAsia"/>
-        </w:rPr>
-        <w:t xml:space="preserve">資料保留率達</w:t>
+        <w:rPr>
+          <w:rFonts w:hint="eastAsia"/>
+        </w:rPr>
+        <w:t xml:space="preserve">人，資料保留率</w:t>
       </w:r>
       <w:r>
         <w:t xml:space="preserve"> 98.97%</w:t>
-      </w:r>
-    </w:p>
-    <w:p>
-      <w:pPr>
-        <w:pStyle w:val="a0"/>
-      </w:pPr>
-      <w:r>
-        <w:rPr>
-          <w:rFonts w:hint="eastAsia"/>
-          <w:b/>
-          <w:bCs/>
-        </w:rPr>
-        <w:t xml:space="preserve">最終樣本數</w:t>
-      </w:r>
-      <w:r>
-        <w:rPr>
-          <w:rFonts w:hint="eastAsia"/>
-        </w:rPr>
-        <w:t xml:space="preserve">：6,056</w:t>
-      </w:r>
-      <w:r>
-        <w:t xml:space="preserve"> </w:t>
-      </w:r>
-      <w:r>
-        <w:rPr>
-          <w:rFonts w:hint="eastAsia"/>
-        </w:rPr>
-        <w:t xml:space="preserve">人</w:t>
       </w:r>
     </w:p>
     <w:p>
@@ -2586,108 +2471,141 @@
         <w:t xml:space="preserve">之間的變化量：</w:t>
       </w:r>
     </w:p>
-    <w:p>
-      <w:pPr>
-        <w:pStyle w:val="a0"/>
-      </w:pPr>
-      <m:oMathPara>
-        <m:oMathParaPr>
-          <m:jc m:val="center"/>
-        </m:oMathParaPr>
-        <m:oMath>
-          <m:sSub>
-            <m:e>
+    <w:tbl>
+      <w:tblPr>
+        <w:tblStyle w:val="Table"/>
+        <w:tblW w:type="auto" w:w="0"/>
+        <w:tblLook w:firstRow="0" w:lastRow="0" w:firstColumn="0" w:lastColumn="0" w:noHBand="0" w:noVBand="0" w:val="0000"/>
+      </w:tblPr>
+      <w:tblGrid>
+        <w:gridCol w:w="2640"/>
+        <w:gridCol w:w="2640"/>
+        <w:gridCol w:w="2640"/>
+      </w:tblGrid>
+      <w:tr>
+        <w:tc>
+          <w:tcPr/>
+          <w:p>
+            <w:pPr>
+              <w:pStyle w:val="Compact"/>
+            </w:pPr>
+          </w:p>
+        </w:tc>
+        <w:tc>
+          <w:tcPr/>
+          <w:p>
+            <w:pPr>
+              <w:pStyle w:val="Compact"/>
+              <w:jc w:val="center"/>
+            </w:pPr>
+            <m:oMath>
+              <m:sSub>
+                <m:e>
+                  <m:r>
+                    <m:rPr>
+                      <m:sty m:val="p"/>
+                    </m:rPr>
+                    <m:t>Δ</m:t>
+                  </m:r>
+                </m:e>
+                <m:sub>
+                  <m:r>
+                    <m:t>i</m:t>
+                  </m:r>
+                </m:sub>
+              </m:sSub>
               <m:r>
                 <m:rPr>
                   <m:sty m:val="p"/>
                 </m:rPr>
-                <m:t>Δ</m:t>
+                <m:t>=</m:t>
               </m:r>
-            </m:e>
-            <m:sub>
-              <m:r>
-                <m:t>i</m:t>
-              </m:r>
-            </m:sub>
-          </m:sSub>
-          <m:r>
-            <m:rPr>
-              <m:sty m:val="p"/>
-            </m:rPr>
-            <m:t>=</m:t>
-          </m:r>
-          <m:sSub>
-            <m:e>
-              <m:r>
-                <m:t>X</m:t>
-              </m:r>
-            </m:e>
-            <m:sub>
-              <m:r>
-                <m:t>i</m:t>
-              </m:r>
-              <m:r>
-                <m:rPr>
-                  <m:sty m:val="p"/>
-                </m:rPr>
-                <m:t>,</m:t>
-              </m:r>
-              <m:r>
-                <m:t>Y</m:t>
-              </m:r>
+              <m:sSub>
+                <m:e>
+                  <m:r>
+                    <m:t>X</m:t>
+                  </m:r>
+                </m:e>
+                <m:sub>
+                  <m:r>
+                    <m:t>i</m:t>
+                  </m:r>
+                  <m:r>
+                    <m:rPr>
+                      <m:sty m:val="p"/>
+                    </m:rPr>
+                    <m:t>,</m:t>
+                  </m:r>
+                  <m:r>
+                    <m:t>Y</m:t>
+                  </m:r>
+                  <m:r>
+                    <m:rPr>
+                      <m:sty m:val="p"/>
+                    </m:rPr>
+                    <m:t>−</m:t>
+                  </m:r>
+                  <m:r>
+                    <m:t>1</m:t>
+                  </m:r>
+                </m:sub>
+              </m:sSub>
               <m:r>
                 <m:rPr>
                   <m:sty m:val="p"/>
                 </m:rPr>
                 <m:t>−</m:t>
               </m:r>
-              <m:r>
-                <m:t>1</m:t>
-              </m:r>
-            </m:sub>
-          </m:sSub>
-          <m:r>
-            <m:rPr>
-              <m:sty m:val="p"/>
-            </m:rPr>
-            <m:t>−</m:t>
-          </m:r>
-          <m:sSub>
-            <m:e>
-              <m:r>
-                <m:t>X</m:t>
-              </m:r>
-            </m:e>
-            <m:sub>
-              <m:r>
-                <m:t>i</m:t>
-              </m:r>
-              <m:r>
-                <m:rPr>
-                  <m:sty m:val="p"/>
-                </m:rPr>
-                <m:t>,</m:t>
-              </m:r>
-              <m:r>
-                <m:t>Y</m:t>
-              </m:r>
-              <m:r>
-                <m:rPr>
-                  <m:sty m:val="p"/>
-                </m:rPr>
-                <m:t>−</m:t>
-              </m:r>
-              <m:r>
-                <m:t>2</m:t>
-              </m:r>
-            </m:sub>
-          </m:sSub>
-        </m:oMath>
-      </m:oMathPara>
-    </w:p>
-    <w:p>
-      <w:pPr>
-        <w:pStyle w:val="FirstParagraph"/>
+              <m:sSub>
+                <m:e>
+                  <m:r>
+                    <m:t>X</m:t>
+                  </m:r>
+                </m:e>
+                <m:sub>
+                  <m:r>
+                    <m:t>i</m:t>
+                  </m:r>
+                  <m:r>
+                    <m:rPr>
+                      <m:sty m:val="p"/>
+                    </m:rPr>
+                    <m:t>,</m:t>
+                  </m:r>
+                  <m:r>
+                    <m:t>Y</m:t>
+                  </m:r>
+                  <m:r>
+                    <m:rPr>
+                      <m:sty m:val="p"/>
+                    </m:rPr>
+                    <m:t>−</m:t>
+                  </m:r>
+                  <m:r>
+                    <m:t>2</m:t>
+                  </m:r>
+                </m:sub>
+              </m:sSub>
+            </m:oMath>
+          </w:p>
+        </w:tc>
+        <w:tc>
+          <w:tcPr/>
+          <w:p>
+            <w:pPr>
+              <w:pStyle w:val="Compact"/>
+              <w:jc w:val="right"/>
+            </w:pPr>
+            <w:r>
+              <w:t xml:space="preserve">(4-1)</w:t>
+            </w:r>
+          </w:p>
+        </w:tc>
+      </w:tr>
+    </w:tbl>
+    <w:p>
+      <w:pPr>
+        <w:pStyle w:val="a0"/>
       </w:pPr>
       <w:r>
         <w:t xml:space="preserve">Δ </w:t>
@@ -3173,13 +3091,13 @@
         <w:t xml:space="preserve">ROC）以偽陽性率（False</w:t>
       </w:r>
       <w:r>
-        <w:t xml:space="preserve"> Positive </w:t>
-      </w:r>
-      <w:r>
-        <w:rPr>
-          <w:rFonts w:hint="eastAsia"/>
-        </w:rPr>
-        <w:t xml:space="preserve">Rate）為</w:t>
+        <w:t xml:space="preserve"> Positive Rate, </w:t>
+      </w:r>
+      <w:r>
+        <w:rPr>
+          <w:rFonts w:hint="eastAsia"/>
+        </w:rPr>
+        <w:t xml:space="preserve">FPR）為</w:t>
       </w:r>
       <w:r>
         <w:t xml:space="preserve"> X </w:t>
@@ -3188,16 +3106,16 @@
         <w:rPr>
           <w:rFonts w:hint="eastAsia"/>
         </w:rPr>
-        <w:t xml:space="preserve">軸，真陽性率（True</w:t>
-      </w:r>
-      <w:r>
-        <w:t xml:space="preserve"> Positive </w:t>
-      </w:r>
-      <w:r>
-        <w:rPr>
-          <w:rFonts w:hint="eastAsia"/>
-        </w:rPr>
-        <w:t xml:space="preserve">Rate）為</w:t>
+        <w:t xml:space="preserve">軸、真陽性率（True</w:t>
+      </w:r>
+      <w:r>
+        <w:t xml:space="preserve"> Positive Rate, </w:t>
+      </w:r>
+      <w:r>
+        <w:rPr>
+          <w:rFonts w:hint="eastAsia"/>
+        </w:rPr>
+        <w:t xml:space="preserve">TPR）為</w:t>
       </w:r>
       <w:r>
         <w:t xml:space="preserve"> Y </w:t>
@@ -3206,16 +3124,57 @@
         <w:rPr>
           <w:rFonts w:hint="eastAsia"/>
         </w:rPr>
-        <w:t xml:space="preserve">軸，AUC</w:t>
-      </w:r>
-      <w:r>
-        <w:t xml:space="preserve"> </w:t>
-      </w:r>
-      <w:r>
-        <w:rPr>
-          <w:rFonts w:hint="eastAsia"/>
-        </w:rPr>
-        <w:t xml:space="preserve">為曲線下面積。</w:t>
+        <w:t xml:space="preserve">軸，繪製不同分類閾值下的</w:t>
+      </w:r>
+      <w:r>
+        <w:t xml:space="preserve"> TPR-FPR </w:t>
+      </w:r>
+      <w:r>
+        <w:rPr>
+          <w:rFonts w:hint="eastAsia"/>
+        </w:rPr>
+        <w:t xml:space="preserve">組合。曲線下面積（Area</w:t>
+      </w:r>
+      <w:r>
+        <w:t xml:space="preserve"> Under the Curve, </w:t>
+      </w:r>
+      <w:r>
+        <w:rPr>
+          <w:rFonts w:hint="eastAsia"/>
+        </w:rPr>
+        <w:t xml:space="preserve">AUC）即為</w:t>
+      </w:r>
+      <w:r>
+        <w:t xml:space="preserve"> ROC </w:t>
+      </w:r>
+      <w:r>
+        <w:rPr>
+          <w:rFonts w:hint="eastAsia"/>
+        </w:rPr>
+        <w:t xml:space="preserve">曲線與</w:t>
+      </w:r>
+      <w:r>
+        <w:t xml:space="preserve"> X </w:t>
+      </w:r>
+      <w:r>
+        <w:rPr>
+          <w:rFonts w:hint="eastAsia"/>
+        </w:rPr>
+        <w:t xml:space="preserve">軸所圍成的面積，其機率詮釋為：隨機抽取一個正樣本與一個負樣本，模型將正樣本排序在前的機率。</w:t>
+      </w:r>
+    </w:p>
+    <w:p>
+      <w:pPr>
+        <w:pStyle w:val="a0"/>
+      </w:pPr>
+      <w:r>
+        <w:t xml:space="preserve">AUC </w:t>
+      </w:r>
+      <w:r>
+        <w:rPr>
+          <w:rFonts w:hint="eastAsia"/>
+        </w:rPr>
+        <w:t xml:space="preserve">的判讀基準如下：</w:t>
       </w:r>
     </w:p>
     <w:p>
@@ -3233,7 +3192,7 @@
         <w:rPr>
           <w:rFonts w:hint="eastAsia"/>
         </w:rPr>
-        <w:t xml:space="preserve">0.5：隨機猜測</w:t>
+        <w:t xml:space="preserve">0.5：等同隨機猜測，模型無鑑別力</w:t>
       </w:r>
     </w:p>
     <w:p>
@@ -3251,7 +3210,7 @@
         <w:rPr>
           <w:rFonts w:hint="eastAsia"/>
         </w:rPr>
-        <w:t xml:space="preserve">0.7-0.8：可接受</w:t>
+        <w:t xml:space="preserve">0.7–0.8：可接受</w:t>
       </w:r>
     </w:p>
     <w:p>
@@ -3269,7 +3228,7 @@
         <w:rPr>
           <w:rFonts w:hint="eastAsia"/>
         </w:rPr>
-        <w:t xml:space="preserve">0.8-0.9：良好</w:t>
+        <w:t xml:space="preserve">0.8–0.9：良好</w:t>
       </w:r>
     </w:p>
     <w:p>
@@ -3297,16 +3256,35 @@
       <w:r>
         <w:rPr>
           <w:rFonts w:hint="eastAsia"/>
-          <w:b/>
-          <w:bCs/>
-        </w:rPr>
-        <w:t xml:space="preserve">特點</w:t>
-      </w:r>
-      <w:r>
-        <w:rPr>
-          <w:rFonts w:hint="eastAsia"/>
-        </w:rPr>
-        <w:t xml:space="preserve">：與分類閾值無關，反映模型的整體排序能力。</w:t>
+        </w:rPr>
+        <w:t xml:space="preserve">本研究選擇</w:t>
+      </w:r>
+      <w:r>
+        <w:t xml:space="preserve"> AUC-ROC </w:t>
+      </w:r>
+      <w:r>
+        <w:rPr>
+          <w:rFonts w:hint="eastAsia"/>
+        </w:rPr>
+        <w:t xml:space="preserve">作為主要評估指標，原因有二：（1）AUC</w:t>
+      </w:r>
+      <w:r>
+        <w:t xml:space="preserve"> </w:t>
+      </w:r>
+      <w:r>
+        <w:rPr>
+          <w:rFonts w:hint="eastAsia"/>
+        </w:rPr>
+        <w:t xml:space="preserve">與分類閾值無關，反映模型在所有可能閾值下的整體排序能力，適合比較不同模型；（2）AUC</w:t>
+      </w:r>
+      <w:r>
+        <w:t xml:space="preserve"> </w:t>
+      </w:r>
+      <w:r>
+        <w:rPr>
+          <w:rFonts w:hint="eastAsia"/>
+        </w:rPr>
+        <w:t xml:space="preserve">不受類別不平衡的直接影響，在三高疾病陽性率較低（5–17%）的情境下仍能提供穩定的效能評估。</w:t>
       </w:r>
     </w:p>
     <w:bookmarkEnd w:id="39"/>
@@ -3322,283 +3300,189 @@
         <w:t xml:space="preserve">敏感度（Sensitivity）</w:t>
       </w:r>
     </w:p>
-    <w:p>
-      <w:pPr>
-        <w:pStyle w:val="FirstParagraph"/>
-      </w:pPr>
-      <m:oMathPara>
-        <m:oMathParaPr>
-          <m:jc m:val="center"/>
-        </m:oMathParaPr>
-        <m:oMath>
-          <m:r>
-            <m:t>S</m:t>
-          </m:r>
-          <m:r>
-            <m:t>e</m:t>
-          </m:r>
-          <m:r>
-            <m:t>n</m:t>
-          </m:r>
-          <m:r>
-            <m:t>s</m:t>
-          </m:r>
-          <m:r>
-            <m:t>i</m:t>
-          </m:r>
-          <m:r>
-            <m:t>t</m:t>
-          </m:r>
-          <m:r>
-            <m:t>i</m:t>
-          </m:r>
-          <m:r>
-            <m:t>v</m:t>
-          </m:r>
-          <m:r>
-            <m:t>i</m:t>
-          </m:r>
-          <m:r>
-            <m:t>t</m:t>
-          </m:r>
-          <m:r>
-            <m:t>y</m:t>
-          </m:r>
-          <m:r>
-            <m:rPr>
-              <m:sty m:val="p"/>
-            </m:rPr>
-            <m:t>=</m:t>
-          </m:r>
-          <m:f>
-            <m:fPr>
-              <m:type m:val="bar"/>
-            </m:fPr>
-            <m:num>
+    <w:tbl>
+      <w:tblPr>
+        <w:tblStyle w:val="Table"/>
+        <w:tblW w:type="auto" w:w="0"/>
+        <w:tblLook w:firstRow="0" w:lastRow="0" w:firstColumn="0" w:lastColumn="0" w:noHBand="0" w:noVBand="0" w:val="0000"/>
+      </w:tblPr>
+      <w:tblGrid>
+        <w:gridCol w:w="2640"/>
+        <w:gridCol w:w="2640"/>
+        <w:gridCol w:w="2640"/>
+      </w:tblGrid>
+      <w:tr>
+        <w:tc>
+          <w:tcPr/>
+          <w:p>
+            <w:pPr>
+              <w:pStyle w:val="Compact"/>
+            </w:pPr>
+          </w:p>
+        </w:tc>
+        <w:tc>
+          <w:tcPr/>
+          <w:p>
+            <w:pPr>
+              <w:pStyle w:val="Compact"/>
+              <w:jc w:val="center"/>
+            </w:pPr>
+            <m:oMath>
               <m:r>
-                <m:t>T</m:t>
+                <m:t>S</m:t>
               </m:r>
               <m:r>
-                <m:t>P</m:t>
-              </m:r>
-            </m:num>
-            <m:den>
-              <m:r>
-                <m:t>T</m:t>
+                <m:t>e</m:t>
               </m:r>
               <m:r>
-                <m:t>P</m:t>
+                <m:t>n</m:t>
+              </m:r>
+              <m:r>
+                <m:t>s</m:t>
+              </m:r>
+              <m:r>
+                <m:t>i</m:t>
+              </m:r>
+              <m:r>
+                <m:t>t</m:t>
+              </m:r>
+              <m:r>
+                <m:t>i</m:t>
+              </m:r>
+              <m:r>
+                <m:t>v</m:t>
+              </m:r>
+              <m:r>
+                <m:t>i</m:t>
+              </m:r>
+              <m:r>
+                <m:t>t</m:t>
+              </m:r>
+              <m:r>
+                <m:t>y</m:t>
               </m:r>
               <m:r>
                 <m:rPr>
                   <m:sty m:val="p"/>
                 </m:rPr>
-                <m:t>+</m:t>
+                <m:t>=</m:t>
+              </m:r>
+              <m:f>
+                <m:fPr>
+                  <m:type m:val="bar"/>
+                </m:fPr>
+                <m:num>
+                  <m:r>
+                    <m:t>T</m:t>
+                  </m:r>
+                  <m:r>
+                    <m:t>P</m:t>
+                  </m:r>
+                </m:num>
+                <m:den>
+                  <m:r>
+                    <m:t>T</m:t>
+                  </m:r>
+                  <m:r>
+                    <m:t>P</m:t>
+                  </m:r>
+                  <m:r>
+                    <m:rPr>
+                      <m:sty m:val="p"/>
+                    </m:rPr>
+                    <m:t>+</m:t>
+                  </m:r>
+                  <m:r>
+                    <m:t>F</m:t>
+                  </m:r>
+                  <m:r>
+                    <m:t>N</m:t>
+                  </m:r>
+                </m:den>
+              </m:f>
+            </m:oMath>
+          </w:p>
+        </w:tc>
+        <w:tc>
+          <w:tcPr/>
+          <w:p>
+            <w:pPr>
+              <w:pStyle w:val="Compact"/>
+              <w:jc w:val="right"/>
+            </w:pPr>
+            <w:r>
+              <w:t xml:space="preserve">(4-2)</w:t>
+            </w:r>
+          </w:p>
+        </w:tc>
+      </w:tr>
+    </w:tbl>
+    <w:p>
+      <w:pPr>
+        <w:pStyle w:val="a0"/>
+      </w:pPr>
+      <w:r>
+        <w:rPr>
+          <w:rFonts w:hint="eastAsia"/>
+        </w:rPr>
+        <w:t xml:space="preserve">代表模型正確識別患病者的能力。在疾病篩檢中，高</w:t>
+      </w:r>
+      <w:r>
+        <w:t xml:space="preserve"> Sensitivity </w:t>
+      </w:r>
+      <w:r>
+        <w:rPr>
+          <w:rFonts w:hint="eastAsia"/>
+        </w:rPr>
+        <w:t xml:space="preserve">意味著較少漏診。</w:t>
+      </w:r>
+    </w:p>
+    <w:bookmarkEnd w:id="40"/>
+    <w:bookmarkStart w:id="41" w:name="特異度specificity"/>
+    <w:p>
+      <w:pPr>
+        <w:pStyle w:val="4"/>
+      </w:pPr>
+      <w:r>
+        <w:rPr>
+          <w:rFonts w:hint="eastAsia"/>
+        </w:rPr>
+        <w:t xml:space="preserve">特異度（Specificity）</w:t>
+      </w:r>
+    </w:p>
+    <w:tbl>
+      <w:tblPr>
+        <w:tblStyle w:val="Table"/>
+        <w:tblW w:type="auto" w:w="0"/>
+        <w:tblLook w:firstRow="0" w:lastRow="0" w:firstColumn="0" w:lastColumn="0" w:noHBand="0" w:noVBand="0" w:val="0000"/>
+      </w:tblPr>
+      <w:tblGrid>
+        <w:gridCol w:w="2640"/>
+        <w:gridCol w:w="2640"/>
+        <w:gridCol w:w="2640"/>
+      </w:tblGrid>
+      <w:tr>
+        <w:tc>
+          <w:tcPr/>
+          <w:p>
+            <w:pPr>
+              <w:pStyle w:val="Compact"/>
+            </w:pPr>
+          </w:p>
+        </w:tc>
+        <w:tc>
+          <w:tcPr/>
+          <w:p>
+            <w:pPr>
+              <w:pStyle w:val="Compact"/>
+              <w:jc w:val="center"/>
+            </w:pPr>
+            <m:oMath>
+              <m:r>
+                <m:t>S</m:t>
               </m:r>
               <m:r>
-                <m:t>F</m:t>
-              </m:r>
-              <m:r>
-                <m:t>N</m:t>
-              </m:r>
-            </m:den>
-          </m:f>
-        </m:oMath>
-      </m:oMathPara>
-    </w:p>
-    <w:p>
-      <w:pPr>
-        <w:pStyle w:val="FirstParagraph"/>
-      </w:pPr>
-      <w:r>
-        <w:rPr>
-          <w:rFonts w:hint="eastAsia"/>
-        </w:rPr>
-        <w:t xml:space="preserve">代表模型正確識別患病者的能力。在疾病篩檢中，高</w:t>
-      </w:r>
-      <w:r>
-        <w:t xml:space="preserve"> Sensitivity </w:t>
-      </w:r>
-      <w:r>
-        <w:rPr>
-          <w:rFonts w:hint="eastAsia"/>
-        </w:rPr>
-        <w:t xml:space="preserve">意味著較少漏診。</w:t>
-      </w:r>
-    </w:p>
-    <w:bookmarkEnd w:id="40"/>
-    <w:bookmarkStart w:id="41" w:name="特異度specificity"/>
-    <w:p>
-      <w:pPr>
-        <w:pStyle w:val="4"/>
-      </w:pPr>
-      <w:r>
-        <w:rPr>
-          <w:rFonts w:hint="eastAsia"/>
-        </w:rPr>
-        <w:t xml:space="preserve">特異度（Specificity）</w:t>
-      </w:r>
-    </w:p>
-    <w:p>
-      <w:pPr>
-        <w:pStyle w:val="FirstParagraph"/>
-      </w:pPr>
-      <m:oMathPara>
-        <m:oMathParaPr>
-          <m:jc m:val="center"/>
-        </m:oMathParaPr>
-        <m:oMath>
-          <m:r>
-            <m:t>S</m:t>
-          </m:r>
-          <m:r>
-            <m:t>p</m:t>
-          </m:r>
-          <m:r>
-            <m:t>e</m:t>
-          </m:r>
-          <m:r>
-            <m:t>c</m:t>
-          </m:r>
-          <m:r>
-            <m:t>i</m:t>
-          </m:r>
-          <m:r>
-            <m:t>f</m:t>
-          </m:r>
-          <m:r>
-            <m:t>i</m:t>
-          </m:r>
-          <m:r>
-            <m:t>c</m:t>
-          </m:r>
-          <m:r>
-            <m:t>i</m:t>
-          </m:r>
-          <m:r>
-            <m:t>t</m:t>
-          </m:r>
-          <m:r>
-            <m:t>y</m:t>
-          </m:r>
-          <m:r>
-            <m:rPr>
-              <m:sty m:val="p"/>
-            </m:rPr>
-            <m:t>=</m:t>
-          </m:r>
-          <m:f>
-            <m:fPr>
-              <m:type m:val="bar"/>
-            </m:fPr>
-            <m:num>
-              <m:r>
-                <m:t>T</m:t>
-              </m:r>
-              <m:r>
-                <m:t>N</m:t>
-              </m:r>
-            </m:num>
-            <m:den>
-              <m:r>
-                <m:t>T</m:t>
-              </m:r>
-              <m:r>
-                <m:t>N</m:t>
-              </m:r>
-              <m:r>
-                <m:rPr>
-                  <m:sty m:val="p"/>
-                </m:rPr>
-                <m:t>+</m:t>
-              </m:r>
-              <m:r>
-                <m:t>F</m:t>
-              </m:r>
-              <m:r>
-                <m:t>P</m:t>
-              </m:r>
-            </m:den>
-          </m:f>
-        </m:oMath>
-      </m:oMathPara>
-    </w:p>
-    <w:p>
-      <w:pPr>
-        <w:pStyle w:val="FirstParagraph"/>
-      </w:pPr>
-      <w:r>
-        <w:rPr>
-          <w:rFonts w:hint="eastAsia"/>
-        </w:rPr>
-        <w:t xml:space="preserve">代表模型正確排除健康者的能力。高</w:t>
-      </w:r>
-      <w:r>
-        <w:t xml:space="preserve"> Specificity </w:t>
-      </w:r>
-      <w:r>
-        <w:rPr>
-          <w:rFonts w:hint="eastAsia"/>
-        </w:rPr>
-        <w:t xml:space="preserve">意味著較少誤診。</w:t>
-      </w:r>
-    </w:p>
-    <w:bookmarkEnd w:id="41"/>
-    <w:bookmarkStart w:id="42" w:name="f1-分數f1-score"/>
-    <w:p>
-      <w:pPr>
-        <w:pStyle w:val="4"/>
-      </w:pPr>
-      <w:r>
-        <w:t xml:space="preserve">F1 </w:t>
-      </w:r>
-      <w:r>
-        <w:rPr>
-          <w:rFonts w:hint="eastAsia"/>
-        </w:rPr>
-        <w:t xml:space="preserve">分數（F1-Score）</w:t>
-      </w:r>
-    </w:p>
-    <w:p>
-      <w:pPr>
-        <w:pStyle w:val="FirstParagraph"/>
-      </w:pPr>
-      <m:oMathPara>
-        <m:oMathParaPr>
-          <m:jc m:val="center"/>
-        </m:oMathParaPr>
-        <m:oMath>
-          <m:r>
-            <m:t>F</m:t>
-          </m:r>
-          <m:r>
-            <m:t>1</m:t>
-          </m:r>
-          <m:r>
-            <m:rPr>
-              <m:sty m:val="p"/>
-            </m:rPr>
-            <m:t>=</m:t>
-          </m:r>
-          <m:r>
-            <m:t>2</m:t>
-          </m:r>
-          <m:r>
-            <m:rPr>
-              <m:sty m:val="p"/>
-            </m:rPr>
-            <m:t>×</m:t>
-          </m:r>
-          <m:f>
-            <m:fPr>
-              <m:type m:val="bar"/>
-            </m:fPr>
-            <m:num>
-              <m:r>
-                <m:t>P</m:t>
-              </m:r>
-              <m:r>
-                <m:t>r</m:t>
+                <m:t>p</m:t>
               </m:r>
               <m:r>
                 <m:t>e</m:t>
@@ -3610,51 +3494,10 @@
                 <m:t>i</m:t>
               </m:r>
               <m:r>
-                <m:t>s</m:t>
+                <m:t>f</m:t>
               </m:r>
               <m:r>
                 <m:t>i</m:t>
-              </m:r>
-              <m:r>
-                <m:t>o</m:t>
-              </m:r>
-              <m:r>
-                <m:t>n</m:t>
-              </m:r>
-              <m:r>
-                <m:rPr>
-                  <m:sty m:val="p"/>
-                </m:rPr>
-                <m:t>×</m:t>
-              </m:r>
-              <m:r>
-                <m:t>R</m:t>
-              </m:r>
-              <m:r>
-                <m:t>e</m:t>
-              </m:r>
-              <m:r>
-                <m:t>c</m:t>
-              </m:r>
-              <m:r>
-                <m:t>a</m:t>
-              </m:r>
-              <m:r>
-                <m:t>l</m:t>
-              </m:r>
-              <m:r>
-                <m:t>l</m:t>
-              </m:r>
-            </m:num>
-            <m:den>
-              <m:r>
-                <m:t>P</m:t>
-              </m:r>
-              <m:r>
-                <m:t>r</m:t>
-              </m:r>
-              <m:r>
-                <m:t>e</m:t>
               </m:r>
               <m:r>
                 <m:t>c</m:t>
@@ -3663,49 +3506,284 @@
                 <m:t>i</m:t>
               </m:r>
               <m:r>
-                <m:t>s</m:t>
+                <m:t>t</m:t>
               </m:r>
               <m:r>
-                <m:t>i</m:t>
-              </m:r>
-              <m:r>
-                <m:t>o</m:t>
-              </m:r>
-              <m:r>
-                <m:t>n</m:t>
+                <m:t>y</m:t>
               </m:r>
               <m:r>
                 <m:rPr>
                   <m:sty m:val="p"/>
                 </m:rPr>
-                <m:t>+</m:t>
+                <m:t>=</m:t>
+              </m:r>
+              <m:f>
+                <m:fPr>
+                  <m:type m:val="bar"/>
+                </m:fPr>
+                <m:num>
+                  <m:r>
+                    <m:t>T</m:t>
+                  </m:r>
+                  <m:r>
+                    <m:t>N</m:t>
+                  </m:r>
+                </m:num>
+                <m:den>
+                  <m:r>
+                    <m:t>T</m:t>
+                  </m:r>
+                  <m:r>
+                    <m:t>N</m:t>
+                  </m:r>
+                  <m:r>
+                    <m:rPr>
+                      <m:sty m:val="p"/>
+                    </m:rPr>
+                    <m:t>+</m:t>
+                  </m:r>
+                  <m:r>
+                    <m:t>F</m:t>
+                  </m:r>
+                  <m:r>
+                    <m:t>P</m:t>
+                  </m:r>
+                </m:den>
+              </m:f>
+            </m:oMath>
+          </w:p>
+        </w:tc>
+        <w:tc>
+          <w:tcPr/>
+          <w:p>
+            <w:pPr>
+              <w:pStyle w:val="Compact"/>
+              <w:jc w:val="right"/>
+            </w:pPr>
+            <w:r>
+              <w:t xml:space="preserve">(4-3)</w:t>
+            </w:r>
+          </w:p>
+        </w:tc>
+      </w:tr>
+    </w:tbl>
+    <w:p>
+      <w:pPr>
+        <w:pStyle w:val="a0"/>
+      </w:pPr>
+      <w:r>
+        <w:rPr>
+          <w:rFonts w:hint="eastAsia"/>
+        </w:rPr>
+        <w:t xml:space="preserve">代表模型正確排除健康者的能力。高</w:t>
+      </w:r>
+      <w:r>
+        <w:t xml:space="preserve"> Specificity </w:t>
+      </w:r>
+      <w:r>
+        <w:rPr>
+          <w:rFonts w:hint="eastAsia"/>
+        </w:rPr>
+        <w:t xml:space="preserve">意味著較少誤診。</w:t>
+      </w:r>
+    </w:p>
+    <w:bookmarkEnd w:id="41"/>
+    <w:bookmarkStart w:id="42" w:name="f1-分數f1-score"/>
+    <w:p>
+      <w:pPr>
+        <w:pStyle w:val="4"/>
+      </w:pPr>
+      <w:r>
+        <w:t xml:space="preserve">F1 </w:t>
+      </w:r>
+      <w:r>
+        <w:rPr>
+          <w:rFonts w:hint="eastAsia"/>
+        </w:rPr>
+        <w:t xml:space="preserve">分數（F1-Score）</w:t>
+      </w:r>
+    </w:p>
+    <w:tbl>
+      <w:tblPr>
+        <w:tblStyle w:val="Table"/>
+        <w:tblW w:type="pct" w:w="5000"/>
+        <w:tblLayout w:type="fixed"/>
+        <w:tblLook w:firstRow="0" w:lastRow="0" w:firstColumn="0" w:lastColumn="0" w:noHBand="0" w:noVBand="0" w:val="0000"/>
+      </w:tblPr>
+      <w:tblGrid>
+        <w:gridCol w:w="1980"/>
+        <w:gridCol w:w="3300"/>
+        <w:gridCol w:w="2640"/>
+      </w:tblGrid>
+      <w:tr>
+        <w:tc>
+          <w:tcPr/>
+          <w:p>
+            <w:pPr>
+              <w:pStyle w:val="Compact"/>
+            </w:pPr>
+          </w:p>
+        </w:tc>
+        <w:tc>
+          <w:tcPr/>
+          <w:p>
+            <w:pPr>
+              <w:pStyle w:val="Compact"/>
+              <w:jc w:val="center"/>
+            </w:pPr>
+            <m:oMath>
+              <m:r>
+                <m:t>F</m:t>
               </m:r>
               <m:r>
-                <m:t>R</m:t>
+                <m:t>1</m:t>
               </m:r>
               <m:r>
-                <m:t>e</m:t>
+                <m:rPr>
+                  <m:sty m:val="p"/>
+                </m:rPr>
+                <m:t>=</m:t>
               </m:r>
               <m:r>
-                <m:t>c</m:t>
+                <m:t>2</m:t>
               </m:r>
               <m:r>
-                <m:t>a</m:t>
+                <m:rPr>
+                  <m:sty m:val="p"/>
+                </m:rPr>
+                <m:t>×</m:t>
               </m:r>
-              <m:r>
-                <m:t>l</m:t>
-              </m:r>
-              <m:r>
-                <m:t>l</m:t>
-              </m:r>
-            </m:den>
-          </m:f>
-        </m:oMath>
-      </m:oMathPara>
-    </w:p>
-    <w:p>
-      <w:pPr>
-        <w:pStyle w:val="FirstParagraph"/>
+              <m:f>
+                <m:fPr>
+                  <m:type m:val="bar"/>
+                </m:fPr>
+                <m:num>
+                  <m:r>
+                    <m:t>P</m:t>
+                  </m:r>
+                  <m:r>
+                    <m:t>r</m:t>
+                  </m:r>
+                  <m:r>
+                    <m:t>e</m:t>
+                  </m:r>
+                  <m:r>
+                    <m:t>c</m:t>
+                  </m:r>
+                  <m:r>
+                    <m:t>i</m:t>
+                  </m:r>
+                  <m:r>
+                    <m:t>s</m:t>
+                  </m:r>
+                  <m:r>
+                    <m:t>i</m:t>
+                  </m:r>
+                  <m:r>
+                    <m:t>o</m:t>
+                  </m:r>
+                  <m:r>
+                    <m:t>n</m:t>
+                  </m:r>
+                  <m:r>
+                    <m:rPr>
+                      <m:sty m:val="p"/>
+                    </m:rPr>
+                    <m:t>×</m:t>
+                  </m:r>
+                  <m:r>
+                    <m:t>R</m:t>
+                  </m:r>
+                  <m:r>
+                    <m:t>e</m:t>
+                  </m:r>
+                  <m:r>
+                    <m:t>c</m:t>
+                  </m:r>
+                  <m:r>
+                    <m:t>a</m:t>
+                  </m:r>
+                  <m:r>
+                    <m:t>l</m:t>
+                  </m:r>
+                  <m:r>
+                    <m:t>l</m:t>
+                  </m:r>
+                </m:num>
+                <m:den>
+                  <m:r>
+                    <m:t>P</m:t>
+                  </m:r>
+                  <m:r>
+                    <m:t>r</m:t>
+                  </m:r>
+                  <m:r>
+                    <m:t>e</m:t>
+                  </m:r>
+                  <m:r>
+                    <m:t>c</m:t>
+                  </m:r>
+                  <m:r>
+                    <m:t>i</m:t>
+                  </m:r>
+                  <m:r>
+                    <m:t>s</m:t>
+                  </m:r>
+                  <m:r>
+                    <m:t>i</m:t>
+                  </m:r>
+                  <m:r>
+                    <m:t>o</m:t>
+                  </m:r>
+                  <m:r>
+                    <m:t>n</m:t>
+                  </m:r>
+                  <m:r>
+                    <m:rPr>
+                      <m:sty m:val="p"/>
+                    </m:rPr>
+                    <m:t>+</m:t>
+                  </m:r>
+                  <m:r>
+                    <m:t>R</m:t>
+                  </m:r>
+                  <m:r>
+                    <m:t>e</m:t>
+                  </m:r>
+                  <m:r>
+                    <m:t>c</m:t>
+                  </m:r>
+                  <m:r>
+                    <m:t>a</m:t>
+                  </m:r>
+                  <m:r>
+                    <m:t>l</m:t>
+                  </m:r>
+                  <m:r>
+                    <m:t>l</m:t>
+                  </m:r>
+                </m:den>
+              </m:f>
+            </m:oMath>
+          </w:p>
+        </w:tc>
+        <w:tc>
+          <w:tcPr/>
+          <w:p>
+            <w:pPr>
+              <w:pStyle w:val="Compact"/>
+              <w:jc w:val="right"/>
+            </w:pPr>
+            <w:r>
+              <w:t xml:space="preserve">(4-4)</w:t>
+            </w:r>
+          </w:p>
+        </w:tc>
+      </w:tr>
+    </w:tbl>
+    <w:p>
+      <w:pPr>
+        <w:pStyle w:val="a0"/>
       </w:pPr>
       <w:r>
         <w:rPr>
@@ -3974,16 +4052,7 @@
         <w:rPr>
           <w:rFonts w:hint="eastAsia"/>
         </w:rPr>
-        <w:t xml:space="preserve">PR-AUC）被認為是更適合的指標（Saito</w:t>
-      </w:r>
-      <w:r>
-        <w:t xml:space="preserve"> &amp; Rehmsmeier, </w:t>
-      </w:r>
-      <w:r>
-        <w:rPr>
-          <w:rFonts w:hint="eastAsia"/>
-        </w:rPr>
-        <w:t xml:space="preserve">2015）。然而，本資料集三項疾病的盛行率分別為高血壓</w:t>
+        <w:t xml:space="preserve">PR-AUC）被認為是更適合的指標[26]。然而，本資料集三項疾病的盛行率分別為高血壓</w:t>
       </w:r>
       <w:r>
         <w:t xml:space="preserve"> </w:t>
@@ -4075,16 +4144,7 @@
         <w:rPr>
           <w:rFonts w:hint="eastAsia"/>
         </w:rPr>
-        <w:t xml:space="preserve">本研究設計一系列消融實驗（Ablation</w:t>
-      </w:r>
-      <w:r>
-        <w:t xml:space="preserve"> </w:t>
-      </w:r>
-      <w:r>
-        <w:rPr>
-          <w:rFonts w:hint="eastAsia"/>
-        </w:rPr>
-        <w:t xml:space="preserve">Study）與比較實驗，以驗證研究問題。實驗設計總覽如表</w:t>
+        <w:t xml:space="preserve">本研究設計十項實驗，涵蓋模型比較、消融實驗、可解釋性分析與方法驗證等面向，以回答第三章所提出的七個研究問題。實驗設計總覽如表</w:t>
       </w:r>
       <w:r>
         <w:t xml:space="preserve"> 4-3 </w:t>
@@ -4122,290 +4182,6 @@
           <w:bCs/>
         </w:rPr>
         <w:t xml:space="preserve">實驗設計總覽</w:t>
-      </w:r>
-    </w:p>
-    <w:tbl>
-      <w:tblPr>
-        <w:tblStyle w:val="Table"/>
-        <w:tblW w:type="auto" w:w="0"/>
-        <w:tblLook w:firstRow="1" w:lastRow="0" w:firstColumn="0" w:lastColumn="0" w:noHBand="0" w:noVBand="0" w:val="0020"/>
-      </w:tblPr>
-      <w:tblGrid>
-        <w:gridCol w:w="3960"/>
-        <w:gridCol w:w="3960"/>
-      </w:tblGrid>
-      <w:tr>
-        <w:trPr>
-          <w:tblHeader w:val="on"/>
-        </w:trPr>
-        <w:tc>
-          <w:tcPr/>
-          <w:p>
-            <w:pPr>
-              <w:pStyle w:val="Compact"/>
-            </w:pPr>
-            <w:r>
-              <w:rPr>
-                <w:rFonts w:hint="eastAsia"/>
-              </w:rPr>
-              <w:t xml:space="preserve">實驗</w:t>
-            </w:r>
-          </w:p>
-        </w:tc>
-        <w:tc>
-          <w:tcPr/>
-          <w:p>
-            <w:pPr>
-              <w:pStyle w:val="Compact"/>
-            </w:pPr>
-            <w:r>
-              <w:rPr>
-                <w:rFonts w:hint="eastAsia"/>
-              </w:rPr>
-              <w:t xml:space="preserve">目的</w:t>
-            </w:r>
-          </w:p>
-        </w:tc>
-      </w:tr>
-      <w:tr>
-        <w:tc>
-          <w:tcPr/>
-          <w:p>
-            <w:pPr>
-              <w:pStyle w:val="Compact"/>
-            </w:pPr>
-            <w:r>
-              <w:t xml:space="preserve">Δ </w:t>
-            </w:r>
-            <w:r>
-              <w:rPr>
-                <w:rFonts w:hint="eastAsia"/>
-              </w:rPr>
-              <w:t xml:space="preserve">特徵消融</w:t>
-            </w:r>
-          </w:p>
-        </w:tc>
-        <w:tc>
-          <w:tcPr/>
-          <w:p>
-            <w:pPr>
-              <w:pStyle w:val="Compact"/>
-            </w:pPr>
-            <w:r>
-              <w:rPr>
-                <w:rFonts w:hint="eastAsia"/>
-              </w:rPr>
-              <w:t xml:space="preserve">驗證變化量特徵的貢獻</w:t>
-            </w:r>
-          </w:p>
-        </w:tc>
-      </w:tr>
-      <w:tr>
-        <w:tc>
-          <w:tcPr/>
-          <w:p>
-            <w:pPr>
-              <w:pStyle w:val="Compact"/>
-            </w:pPr>
-            <w:r>
-              <w:rPr>
-                <w:rFonts w:hint="eastAsia"/>
-              </w:rPr>
-              <w:t xml:space="preserve">模型比較</w:t>
-            </w:r>
-          </w:p>
-        </w:tc>
-        <w:tc>
-          <w:tcPr/>
-          <w:p>
-            <w:pPr>
-              <w:pStyle w:val="Compact"/>
-            </w:pPr>
-            <w:r>
-              <w:rPr>
-                <w:rFonts w:hint="eastAsia"/>
-              </w:rPr>
-              <w:t xml:space="preserve">比較簡單與複雜模型效能</w:t>
-            </w:r>
-          </w:p>
-        </w:tc>
-      </w:tr>
-      <w:tr>
-        <w:tc>
-          <w:tcPr/>
-          <w:p>
-            <w:pPr>
-              <w:pStyle w:val="Compact"/>
-            </w:pPr>
-            <w:r>
-              <w:rPr>
-                <w:rFonts w:hint="eastAsia"/>
-              </w:rPr>
-              <w:t xml:space="preserve">特徵選擇消融</w:t>
-            </w:r>
-          </w:p>
-        </w:tc>
-        <w:tc>
-          <w:tcPr/>
-          <w:p>
-            <w:pPr>
-              <w:pStyle w:val="Compact"/>
-            </w:pPr>
-            <w:r>
-              <w:rPr>
-                <w:rFonts w:hint="eastAsia"/>
-              </w:rPr>
-              <w:t xml:space="preserve">驗證精簡特徵集的可行性</w:t>
-            </w:r>
-          </w:p>
-        </w:tc>
-      </w:tr>
-      <w:tr>
-        <w:tc>
-          <w:tcPr/>
-          <w:p>
-            <w:pPr>
-              <w:pStyle w:val="Compact"/>
-            </w:pPr>
-            <w:r>
-              <w:rPr>
-                <w:rFonts w:hint="eastAsia"/>
-              </w:rPr>
-              <w:t xml:space="preserve">類別不平衡處理比較</w:t>
-            </w:r>
-          </w:p>
-        </w:tc>
-        <w:tc>
-          <w:tcPr/>
-          <w:p>
-            <w:pPr>
-              <w:pStyle w:val="Compact"/>
-            </w:pPr>
-            <w:r>
-              <w:rPr>
-                <w:rFonts w:hint="eastAsia"/>
-              </w:rPr>
-              <w:t xml:space="preserve">比較不同不平衡處理方法</w:t>
-            </w:r>
-          </w:p>
-        </w:tc>
-      </w:tr>
-      <w:tr>
-        <w:tc>
-          <w:tcPr/>
-          <w:p>
-            <w:pPr>
-              <w:pStyle w:val="Compact"/>
-            </w:pPr>
-            <w:r>
-              <w:rPr>
-                <w:rFonts w:hint="eastAsia"/>
-              </w:rPr>
-              <w:t xml:space="preserve">符號回歸實驗</w:t>
-            </w:r>
-          </w:p>
-        </w:tc>
-        <w:tc>
-          <w:tcPr/>
-          <w:p>
-            <w:pPr>
-              <w:pStyle w:val="Compact"/>
-            </w:pPr>
-            <w:r>
-              <w:rPr>
-                <w:rFonts w:hint="eastAsia"/>
-              </w:rPr>
-              <w:t xml:space="preserve">探索可解釋數學公式</w:t>
-            </w:r>
-          </w:p>
-        </w:tc>
-      </w:tr>
-    </w:tbl>
-    <w:bookmarkStart w:id="49" w:name="消融實驗"/>
-    <w:p>
-      <w:pPr>
-        <w:pStyle w:val="3"/>
-      </w:pPr>
-      <w:r>
-        <w:t xml:space="preserve">4.5.1 </w:t>
-      </w:r>
-      <w:r>
-        <w:rPr>
-          <w:rFonts w:hint="eastAsia"/>
-        </w:rPr>
-        <w:t xml:space="preserve">消融實驗</w:t>
-      </w:r>
-    </w:p>
-    <w:bookmarkStart w:id="47" w:name="δ-特徵消融實驗"/>
-    <w:p>
-      <w:pPr>
-        <w:pStyle w:val="4"/>
-      </w:pPr>
-      <w:r>
-        <w:t xml:space="preserve">Δ </w:t>
-      </w:r>
-      <w:r>
-        <w:rPr>
-          <w:rFonts w:hint="eastAsia"/>
-        </w:rPr>
-        <w:t xml:space="preserve">特徵消融實驗</w:t>
-      </w:r>
-    </w:p>
-    <w:p>
-      <w:pPr>
-        <w:pStyle w:val="FirstParagraph"/>
-      </w:pPr>
-      <w:r>
-        <w:rPr>
-          <w:rFonts w:hint="eastAsia"/>
-        </w:rPr>
-        <w:t xml:space="preserve">為驗證</w:t>
-      </w:r>
-      <w:r>
-        <w:t xml:space="preserve"> Δ </w:t>
-      </w:r>
-      <w:r>
-        <w:rPr>
-          <w:rFonts w:hint="eastAsia"/>
-        </w:rPr>
-        <w:t xml:space="preserve">特徵對預測效能的貢獻，本研究設計五組特徵組合進行消融實驗，如表</w:t>
-      </w:r>
-      <w:r>
-        <w:t xml:space="preserve"> 4-4 </w:t>
-      </w:r>
-      <w:r>
-        <w:rPr>
-          <w:rFonts w:hint="eastAsia"/>
-        </w:rPr>
-        <w:t xml:space="preserve">所示。</w:t>
-      </w:r>
-    </w:p>
-    <w:p>
-      <w:pPr>
-        <w:pStyle w:val="a0"/>
-      </w:pPr>
-      <w:r>
-        <w:rPr>
-          <w:rFonts w:hint="eastAsia"/>
-          <w:b/>
-          <w:bCs/>
-        </w:rPr>
-        <w:t xml:space="preserve">表</w:t>
-      </w:r>
-      <w:r>
-        <w:rPr>
-          <w:b/>
-          <w:bCs/>
-        </w:rPr>
-        <w:t xml:space="preserve"> 4-4 Δ </w:t>
-      </w:r>
-      <w:r>
-        <w:rPr>
-          <w:rFonts w:hint="eastAsia"/>
-          <w:b/>
-          <w:bCs/>
-        </w:rPr>
-        <w:t xml:space="preserve">特徵消融實驗設計</w:t>
       </w:r>
     </w:p>
     <w:tbl>
@@ -4434,6 +4210,699 @@
               <w:rPr>
                 <w:rFonts w:hint="eastAsia"/>
               </w:rPr>
+              <w:t xml:space="preserve">編號</w:t>
+            </w:r>
+          </w:p>
+        </w:tc>
+        <w:tc>
+          <w:tcPr/>
+          <w:p>
+            <w:pPr>
+              <w:pStyle w:val="Compact"/>
+            </w:pPr>
+            <w:r>
+              <w:rPr>
+                <w:rFonts w:hint="eastAsia"/>
+              </w:rPr>
+              <w:t xml:space="preserve">實驗</w:t>
+            </w:r>
+          </w:p>
+        </w:tc>
+        <w:tc>
+          <w:tcPr/>
+          <w:p>
+            <w:pPr>
+              <w:pStyle w:val="Compact"/>
+            </w:pPr>
+            <w:r>
+              <w:rPr>
+                <w:rFonts w:hint="eastAsia"/>
+              </w:rPr>
+              <w:t xml:space="preserve">目的</w:t>
+            </w:r>
+          </w:p>
+        </w:tc>
+        <w:tc>
+          <w:tcPr/>
+          <w:p>
+            <w:pPr>
+              <w:pStyle w:val="Compact"/>
+            </w:pPr>
+            <w:r>
+              <w:rPr>
+                <w:rFonts w:hint="eastAsia"/>
+              </w:rPr>
+              <w:t xml:space="preserve">對應</w:t>
+            </w:r>
+            <w:r>
+              <w:t xml:space="preserve"> Q</w:t>
+            </w:r>
+          </w:p>
+        </w:tc>
+      </w:tr>
+      <w:tr>
+        <w:tc>
+          <w:tcPr/>
+          <w:p>
+            <w:pPr>
+              <w:pStyle w:val="Compact"/>
+            </w:pPr>
+            <w:r>
+              <w:t xml:space="preserve">1</w:t>
+            </w:r>
+          </w:p>
+        </w:tc>
+        <w:tc>
+          <w:tcPr/>
+          <w:p>
+            <w:pPr>
+              <w:pStyle w:val="Compact"/>
+            </w:pPr>
+            <w:r>
+              <w:rPr>
+                <w:rFonts w:hint="eastAsia"/>
+              </w:rPr>
+              <w:t xml:space="preserve">模型性能比較</w:t>
+            </w:r>
+          </w:p>
+        </w:tc>
+        <w:tc>
+          <w:tcPr/>
+          <w:p>
+            <w:pPr>
+              <w:pStyle w:val="Compact"/>
+            </w:pPr>
+            <w:r>
+              <w:rPr>
+                <w:rFonts w:hint="eastAsia"/>
+              </w:rPr>
+              <w:t xml:space="preserve">比較十種模型的預測效能</w:t>
+            </w:r>
+          </w:p>
+        </w:tc>
+        <w:tc>
+          <w:tcPr/>
+          <w:p>
+            <w:pPr>
+              <w:pStyle w:val="Compact"/>
+            </w:pPr>
+            <w:r>
+              <w:t xml:space="preserve">Q2</w:t>
+            </w:r>
+          </w:p>
+        </w:tc>
+      </w:tr>
+      <w:tr>
+        <w:tc>
+          <w:tcPr/>
+          <w:p>
+            <w:pPr>
+              <w:pStyle w:val="Compact"/>
+            </w:pPr>
+            <w:r>
+              <w:t xml:space="preserve">2</w:t>
+            </w:r>
+          </w:p>
+        </w:tc>
+        <w:tc>
+          <w:tcPr/>
+          <w:p>
+            <w:pPr>
+              <w:pStyle w:val="Compact"/>
+            </w:pPr>
+            <w:r>
+              <w:t xml:space="preserve">SHAP </w:t>
+            </w:r>
+            <w:r>
+              <w:rPr>
+                <w:rFonts w:hint="eastAsia"/>
+              </w:rPr>
+              <w:t xml:space="preserve">特徵重要性分析</w:t>
+            </w:r>
+          </w:p>
+        </w:tc>
+        <w:tc>
+          <w:tcPr/>
+          <w:p>
+            <w:pPr>
+              <w:pStyle w:val="Compact"/>
+            </w:pPr>
+            <w:r>
+              <w:rPr>
+                <w:rFonts w:hint="eastAsia"/>
+              </w:rPr>
+              <w:t xml:space="preserve">識別關鍵風險因子</w:t>
+            </w:r>
+          </w:p>
+        </w:tc>
+        <w:tc>
+          <w:tcPr/>
+          <w:p>
+            <w:pPr>
+              <w:pStyle w:val="Compact"/>
+            </w:pPr>
+            <w:r>
+              <w:t xml:space="preserve">Q4</w:t>
+            </w:r>
+          </w:p>
+        </w:tc>
+      </w:tr>
+      <w:tr>
+        <w:tc>
+          <w:tcPr/>
+          <w:p>
+            <w:pPr>
+              <w:pStyle w:val="Compact"/>
+            </w:pPr>
+            <w:r>
+              <w:t xml:space="preserve">3</w:t>
+            </w:r>
+          </w:p>
+        </w:tc>
+        <w:tc>
+          <w:tcPr/>
+          <w:p>
+            <w:pPr>
+              <w:pStyle w:val="Compact"/>
+            </w:pPr>
+            <w:r>
+              <w:t xml:space="preserve">Δ </w:t>
+            </w:r>
+            <w:r>
+              <w:rPr>
+                <w:rFonts w:hint="eastAsia"/>
+              </w:rPr>
+              <w:t xml:space="preserve">特徵消融</w:t>
+            </w:r>
+          </w:p>
+        </w:tc>
+        <w:tc>
+          <w:tcPr/>
+          <w:p>
+            <w:pPr>
+              <w:pStyle w:val="Compact"/>
+            </w:pPr>
+            <w:r>
+              <w:rPr>
+                <w:rFonts w:hint="eastAsia"/>
+              </w:rPr>
+              <w:t xml:space="preserve">驗證變化量特徵的貢獻</w:t>
+            </w:r>
+          </w:p>
+        </w:tc>
+        <w:tc>
+          <w:tcPr/>
+          <w:p>
+            <w:pPr>
+              <w:pStyle w:val="Compact"/>
+            </w:pPr>
+            <w:r>
+              <w:t xml:space="preserve">Q1</w:t>
+            </w:r>
+          </w:p>
+        </w:tc>
+      </w:tr>
+      <w:tr>
+        <w:tc>
+          <w:tcPr/>
+          <w:p>
+            <w:pPr>
+              <w:pStyle w:val="Compact"/>
+            </w:pPr>
+            <w:r>
+              <w:t xml:space="preserve">4</w:t>
+            </w:r>
+          </w:p>
+        </w:tc>
+        <w:tc>
+          <w:tcPr/>
+          <w:p>
+            <w:pPr>
+              <w:pStyle w:val="Compact"/>
+            </w:pPr>
+            <w:r>
+              <w:rPr>
+                <w:rFonts w:hint="eastAsia"/>
+              </w:rPr>
+              <w:t xml:space="preserve">特徵選擇消融</w:t>
+            </w:r>
+          </w:p>
+        </w:tc>
+        <w:tc>
+          <w:tcPr/>
+          <w:p>
+            <w:pPr>
+              <w:pStyle w:val="Compact"/>
+            </w:pPr>
+            <w:r>
+              <w:rPr>
+                <w:rFonts w:hint="eastAsia"/>
+              </w:rPr>
+              <w:t xml:space="preserve">驗證精簡特徵集的可行性</w:t>
+            </w:r>
+          </w:p>
+        </w:tc>
+        <w:tc>
+          <w:tcPr/>
+          <w:p>
+            <w:pPr>
+              <w:pStyle w:val="Compact"/>
+            </w:pPr>
+            <w:r>
+              <w:t xml:space="preserve">Q5</w:t>
+            </w:r>
+          </w:p>
+        </w:tc>
+      </w:tr>
+      <w:tr>
+        <w:tc>
+          <w:tcPr/>
+          <w:p>
+            <w:pPr>
+              <w:pStyle w:val="Compact"/>
+            </w:pPr>
+            <w:r>
+              <w:t xml:space="preserve">5</w:t>
+            </w:r>
+          </w:p>
+        </w:tc>
+        <w:tc>
+          <w:tcPr/>
+          <w:p>
+            <w:pPr>
+              <w:pStyle w:val="Compact"/>
+            </w:pPr>
+            <w:r>
+              <w:rPr>
+                <w:rFonts w:hint="eastAsia"/>
+              </w:rPr>
+              <w:t xml:space="preserve">類別不平衡處理比較</w:t>
+            </w:r>
+          </w:p>
+        </w:tc>
+        <w:tc>
+          <w:tcPr/>
+          <w:p>
+            <w:pPr>
+              <w:pStyle w:val="Compact"/>
+            </w:pPr>
+            <w:r>
+              <w:rPr>
+                <w:rFonts w:hint="eastAsia"/>
+              </w:rPr>
+              <w:t xml:space="preserve">比較不同不平衡處理方法</w:t>
+            </w:r>
+          </w:p>
+        </w:tc>
+        <w:tc>
+          <w:tcPr/>
+          <w:p>
+            <w:pPr>
+              <w:pStyle w:val="Compact"/>
+            </w:pPr>
+            <w:r>
+              <w:t xml:space="preserve">—</w:t>
+            </w:r>
+          </w:p>
+        </w:tc>
+      </w:tr>
+      <w:tr>
+        <w:tc>
+          <w:tcPr/>
+          <w:p>
+            <w:pPr>
+              <w:pStyle w:val="Compact"/>
+            </w:pPr>
+            <w:r>
+              <w:t xml:space="preserve">6</w:t>
+            </w:r>
+          </w:p>
+        </w:tc>
+        <w:tc>
+          <w:tcPr/>
+          <w:p>
+            <w:pPr>
+              <w:pStyle w:val="Compact"/>
+            </w:pPr>
+            <w:r>
+              <w:rPr>
+                <w:rFonts w:hint="eastAsia"/>
+              </w:rPr>
+              <w:t xml:space="preserve">資料篩選策略比較</w:t>
+            </w:r>
+          </w:p>
+        </w:tc>
+        <w:tc>
+          <w:tcPr/>
+          <w:p>
+            <w:pPr>
+              <w:pStyle w:val="Compact"/>
+            </w:pPr>
+            <w:r>
+              <w:rPr>
+                <w:rFonts w:hint="eastAsia"/>
+              </w:rPr>
+              <w:t xml:space="preserve">比較滑動窗口與寬格式</w:t>
+            </w:r>
+          </w:p>
+        </w:tc>
+        <w:tc>
+          <w:tcPr/>
+          <w:p>
+            <w:pPr>
+              <w:pStyle w:val="Compact"/>
+            </w:pPr>
+            <w:r>
+              <w:t xml:space="preserve">—</w:t>
+            </w:r>
+          </w:p>
+        </w:tc>
+      </w:tr>
+      <w:tr>
+        <w:tc>
+          <w:tcPr/>
+          <w:p>
+            <w:pPr>
+              <w:pStyle w:val="Compact"/>
+            </w:pPr>
+            <w:r>
+              <w:t xml:space="preserve">7</w:t>
+            </w:r>
+          </w:p>
+        </w:tc>
+        <w:tc>
+          <w:tcPr/>
+          <w:p>
+            <w:pPr>
+              <w:pStyle w:val="Compact"/>
+            </w:pPr>
+            <w:r>
+              <w:rPr>
+                <w:rFonts w:hint="eastAsia"/>
+              </w:rPr>
+              <w:t xml:space="preserve">健檢次數與預測效能</w:t>
+            </w:r>
+          </w:p>
+        </w:tc>
+        <w:tc>
+          <w:tcPr/>
+          <w:p>
+            <w:pPr>
+              <w:pStyle w:val="Compact"/>
+            </w:pPr>
+            <w:r>
+              <w:rPr>
+                <w:rFonts w:hint="eastAsia"/>
+              </w:rPr>
+              <w:t xml:space="preserve">分析累積健檢次數的影響</w:t>
+            </w:r>
+          </w:p>
+        </w:tc>
+        <w:tc>
+          <w:tcPr/>
+          <w:p>
+            <w:pPr>
+              <w:pStyle w:val="Compact"/>
+            </w:pPr>
+            <w:r>
+              <w:t xml:space="preserve">Q6</w:t>
+            </w:r>
+          </w:p>
+        </w:tc>
+      </w:tr>
+      <w:tr>
+        <w:tc>
+          <w:tcPr/>
+          <w:p>
+            <w:pPr>
+              <w:pStyle w:val="Compact"/>
+            </w:pPr>
+            <w:r>
+              <w:t xml:space="preserve">8</w:t>
+            </w:r>
+          </w:p>
+        </w:tc>
+        <w:tc>
+          <w:tcPr/>
+          <w:p>
+            <w:pPr>
+              <w:pStyle w:val="Compact"/>
+            </w:pPr>
+            <w:r>
+              <w:rPr>
+                <w:rFonts w:hint="eastAsia"/>
+              </w:rPr>
+              <w:t xml:space="preserve">各時間點獨立預測力</w:t>
+            </w:r>
+          </w:p>
+        </w:tc>
+        <w:tc>
+          <w:tcPr/>
+          <w:p>
+            <w:pPr>
+              <w:pStyle w:val="Compact"/>
+            </w:pPr>
+            <w:r>
+              <w:rPr>
+                <w:rFonts w:hint="eastAsia"/>
+              </w:rPr>
+              <w:t xml:space="preserve">比較不同時間點的預測貢獻</w:t>
+            </w:r>
+          </w:p>
+        </w:tc>
+        <w:tc>
+          <w:tcPr/>
+          <w:p>
+            <w:pPr>
+              <w:pStyle w:val="Compact"/>
+            </w:pPr>
+            <w:r>
+              <w:t xml:space="preserve">Q7</w:t>
+            </w:r>
+          </w:p>
+        </w:tc>
+      </w:tr>
+      <w:tr>
+        <w:tc>
+          <w:tcPr/>
+          <w:p>
+            <w:pPr>
+              <w:pStyle w:val="Compact"/>
+            </w:pPr>
+            <w:r>
+              <w:t xml:space="preserve">9</w:t>
+            </w:r>
+          </w:p>
+        </w:tc>
+        <w:tc>
+          <w:tcPr/>
+          <w:p>
+            <w:pPr>
+              <w:pStyle w:val="Compact"/>
+            </w:pPr>
+            <w:r>
+              <w:t xml:space="preserve">MTL vs STL </w:t>
+            </w:r>
+            <w:r>
+              <w:rPr>
+                <w:rFonts w:hint="eastAsia"/>
+              </w:rPr>
+              <w:t xml:space="preserve">比較</w:t>
+            </w:r>
+          </w:p>
+        </w:tc>
+        <w:tc>
+          <w:tcPr/>
+          <w:p>
+            <w:pPr>
+              <w:pStyle w:val="Compact"/>
+            </w:pPr>
+            <w:r>
+              <w:rPr>
+                <w:rFonts w:hint="eastAsia"/>
+              </w:rPr>
+              <w:t xml:space="preserve">比較多任務與單任務學習</w:t>
+            </w:r>
+          </w:p>
+        </w:tc>
+        <w:tc>
+          <w:tcPr/>
+          <w:p>
+            <w:pPr>
+              <w:pStyle w:val="Compact"/>
+            </w:pPr>
+            <w:r>
+              <w:t xml:space="preserve">Q3</w:t>
+            </w:r>
+          </w:p>
+        </w:tc>
+      </w:tr>
+      <w:tr>
+        <w:tc>
+          <w:tcPr/>
+          <w:p>
+            <w:pPr>
+              <w:pStyle w:val="Compact"/>
+            </w:pPr>
+            <w:r>
+              <w:t xml:space="preserve">10</w:t>
+            </w:r>
+          </w:p>
+        </w:tc>
+        <w:tc>
+          <w:tcPr/>
+          <w:p>
+            <w:pPr>
+              <w:pStyle w:val="Compact"/>
+            </w:pPr>
+            <w:r>
+              <w:rPr>
+                <w:rFonts w:hint="eastAsia"/>
+              </w:rPr>
+              <w:t xml:space="preserve">符號回歸</w:t>
+            </w:r>
+          </w:p>
+        </w:tc>
+        <w:tc>
+          <w:tcPr/>
+          <w:p>
+            <w:pPr>
+              <w:pStyle w:val="Compact"/>
+            </w:pPr>
+            <w:r>
+              <w:rPr>
+                <w:rFonts w:hint="eastAsia"/>
+              </w:rPr>
+              <w:t xml:space="preserve">探索可解釋數學公式</w:t>
+            </w:r>
+          </w:p>
+        </w:tc>
+        <w:tc>
+          <w:tcPr/>
+          <w:p>
+            <w:pPr>
+              <w:pStyle w:val="Compact"/>
+            </w:pPr>
+            <w:r>
+              <w:t xml:space="preserve">—</w:t>
+            </w:r>
+          </w:p>
+        </w:tc>
+      </w:tr>
+    </w:tbl>
+    <w:bookmarkStart w:id="49" w:name="消融實驗"/>
+    <w:p>
+      <w:pPr>
+        <w:pStyle w:val="3"/>
+      </w:pPr>
+      <w:r>
+        <w:t xml:space="preserve">4.5.1 </w:t>
+      </w:r>
+      <w:r>
+        <w:rPr>
+          <w:rFonts w:hint="eastAsia"/>
+        </w:rPr>
+        <w:t xml:space="preserve">消融實驗</w:t>
+      </w:r>
+    </w:p>
+    <w:bookmarkStart w:id="47" w:name="δ-特徵消融實驗"/>
+    <w:p>
+      <w:pPr>
+        <w:pStyle w:val="4"/>
+      </w:pPr>
+      <w:r>
+        <w:t xml:space="preserve">Δ </w:t>
+      </w:r>
+      <w:r>
+        <w:rPr>
+          <w:rFonts w:hint="eastAsia"/>
+        </w:rPr>
+        <w:t xml:space="preserve">特徵消融實驗</w:t>
+      </w:r>
+    </w:p>
+    <w:p>
+      <w:pPr>
+        <w:pStyle w:val="FirstParagraph"/>
+      </w:pPr>
+      <w:r>
+        <w:rPr>
+          <w:rFonts w:hint="eastAsia"/>
+        </w:rPr>
+        <w:t xml:space="preserve">為驗證</w:t>
+      </w:r>
+      <w:r>
+        <w:t xml:space="preserve"> Δ </w:t>
+      </w:r>
+      <w:r>
+        <w:rPr>
+          <w:rFonts w:hint="eastAsia"/>
+        </w:rPr>
+        <w:t xml:space="preserve">特徵對預測效能的貢獻，本研究設計五組特徵組合進行消融實驗，如表</w:t>
+      </w:r>
+      <w:r>
+        <w:t xml:space="preserve"> 4-4 </w:t>
+      </w:r>
+      <w:r>
+        <w:rPr>
+          <w:rFonts w:hint="eastAsia"/>
+        </w:rPr>
+        <w:t xml:space="preserve">所示。</w:t>
+      </w:r>
+    </w:p>
+    <w:p>
+      <w:pPr>
+        <w:pStyle w:val="a0"/>
+      </w:pPr>
+      <w:r>
+        <w:rPr>
+          <w:rFonts w:hint="eastAsia"/>
+          <w:b/>
+          <w:bCs/>
+        </w:rPr>
+        <w:t xml:space="preserve">表</w:t>
+      </w:r>
+      <w:r>
+        <w:rPr>
+          <w:b/>
+          <w:bCs/>
+        </w:rPr>
+        <w:t xml:space="preserve"> 4-4 Δ </w:t>
+      </w:r>
+      <w:r>
+        <w:rPr>
+          <w:rFonts w:hint="eastAsia"/>
+          <w:b/>
+          <w:bCs/>
+        </w:rPr>
+        <w:t xml:space="preserve">特徵消融實驗設計</w:t>
+      </w:r>
+    </w:p>
+    <w:tbl>
+      <w:tblPr>
+        <w:tblStyle w:val="Table"/>
+        <w:tblW w:type="auto" w:w="0"/>
+        <w:tblLook w:firstRow="1" w:lastRow="0" w:firstColumn="0" w:lastColumn="0" w:noHBand="0" w:noVBand="0" w:val="0020"/>
+      </w:tblPr>
+      <w:tblGrid>
+        <w:gridCol w:w="1980"/>
+        <w:gridCol w:w="1980"/>
+        <w:gridCol w:w="1980"/>
+        <w:gridCol w:w="1980"/>
+      </w:tblGrid>
+      <w:tr>
+        <w:trPr>
+          <w:tblHeader w:val="on"/>
+        </w:trPr>
+        <w:tc>
+          <w:tcPr/>
+          <w:p>
+            <w:pPr>
+              <w:pStyle w:val="Compact"/>
+            </w:pPr>
+            <w:r>
+              <w:rPr>
+                <w:rFonts w:hint="eastAsia"/>
+              </w:rPr>
               <w:t xml:space="preserve">實驗組</w:t>
             </w:r>
           </w:p>
@@ -4775,7 +5244,25 @@
         <w:rPr>
           <w:rFonts w:hint="eastAsia"/>
         </w:rPr>
-        <w:t xml:space="preserve">所示。</w:t>
+        <w:t xml:space="preserve">所示。此設計旨在探討預測效能隨特徵數量的變化趨勢，並找出效能與簡潔性之間的平衡點。特別是</w:t>
+      </w:r>
+      <w:r>
+        <w:t xml:space="preserve"> Top 1 </w:t>
+      </w:r>
+      <w:r>
+        <w:rPr>
+          <w:rFonts w:hint="eastAsia"/>
+        </w:rPr>
+        <w:t xml:space="preserve">與</w:t>
+      </w:r>
+      <w:r>
+        <w:t xml:space="preserve"> Top 2 </w:t>
+      </w:r>
+      <w:r>
+        <w:rPr>
+          <w:rFonts w:hint="eastAsia"/>
+        </w:rPr>
+        <w:t xml:space="preserve">實驗可檢驗單一核心生物標記是否足以達到臨床可用的預測性能，對基層醫療單位的精簡部署具有直接參考價值。</w:t>
       </w:r>
     </w:p>
     <w:p>
@@ -4872,18 +5359,18 @@
               <w:pStyle w:val="Compact"/>
             </w:pPr>
             <w:r>
-              <w:t xml:space="preserve">Top 3</w:t>
-            </w:r>
-          </w:p>
-        </w:tc>
-        <w:tc>
-          <w:tcPr/>
-          <w:p>
-            <w:pPr>
-              <w:pStyle w:val="Compact"/>
-            </w:pPr>
-            <w:r>
-              <w:t xml:space="preserve">3</w:t>
+              <w:t xml:space="preserve">Top 1</w:t>
+            </w:r>
+          </w:p>
+        </w:tc>
+        <w:tc>
+          <w:tcPr/>
+          <w:p>
+            <w:pPr>
+              <w:pStyle w:val="Compact"/>
+            </w:pPr>
+            <w:r>
+              <w:t xml:space="preserve">1</w:t>
             </w:r>
           </w:p>
         </w:tc>
@@ -4900,7 +5387,7 @@
               <w:t xml:space="preserve">僅使用最重要的</w:t>
             </w:r>
             <w:r>
-              <w:t xml:space="preserve"> 3 </w:t>
+              <w:t xml:space="preserve"> 1 </w:t>
             </w:r>
             <w:r>
               <w:rPr>
@@ -4919,41 +5406,41 @@
               <w:pStyle w:val="Compact"/>
             </w:pPr>
             <w:r>
-              <w:t xml:space="preserve">Top 5</w:t>
-            </w:r>
-          </w:p>
-        </w:tc>
-        <w:tc>
-          <w:tcPr/>
-          <w:p>
-            <w:pPr>
-              <w:pStyle w:val="Compact"/>
-            </w:pPr>
-            <w:r>
-              <w:t xml:space="preserve">5</w:t>
-            </w:r>
-          </w:p>
-        </w:tc>
-        <w:tc>
-          <w:tcPr/>
-          <w:p>
-            <w:pPr>
-              <w:pStyle w:val="Compact"/>
-            </w:pPr>
-            <w:r>
-              <w:rPr>
-                <w:rFonts w:hint="eastAsia"/>
-              </w:rPr>
-              <w:t xml:space="preserve">僅使用最重要的</w:t>
-            </w:r>
-            <w:r>
-              <w:t xml:space="preserve"> 5 </w:t>
-            </w:r>
-            <w:r>
-              <w:rPr>
-                <w:rFonts w:hint="eastAsia"/>
-              </w:rPr>
-              <w:t xml:space="preserve">個特徵</w:t>
+              <w:t xml:space="preserve">Top 2</w:t>
+            </w:r>
+          </w:p>
+        </w:tc>
+        <w:tc>
+          <w:tcPr/>
+          <w:p>
+            <w:pPr>
+              <w:pStyle w:val="Compact"/>
+            </w:pPr>
+            <w:r>
+              <w:t xml:space="preserve">2</w:t>
+            </w:r>
+          </w:p>
+        </w:tc>
+        <w:tc>
+          <w:tcPr/>
+          <w:p>
+            <w:pPr>
+              <w:pStyle w:val="Compact"/>
+            </w:pPr>
+            <w:r>
+              <w:rPr>
+                <w:rFonts w:hint="eastAsia"/>
+              </w:rPr>
+              <w:t xml:space="preserve">使用前</w:t>
+            </w:r>
+            <w:r>
+              <w:t xml:space="preserve"> 2 </w:t>
+            </w:r>
+            <w:r>
+              <w:rPr>
+                <w:rFonts w:hint="eastAsia"/>
+              </w:rPr>
+              <w:t xml:space="preserve">個重要特徵</w:t>
             </w:r>
           </w:p>
         </w:tc>
@@ -4966,18 +5453,18 @@
               <w:pStyle w:val="Compact"/>
             </w:pPr>
             <w:r>
-              <w:t xml:space="preserve">Top 10</w:t>
-            </w:r>
-          </w:p>
-        </w:tc>
-        <w:tc>
-          <w:tcPr/>
-          <w:p>
-            <w:pPr>
-              <w:pStyle w:val="Compact"/>
-            </w:pPr>
-            <w:r>
-              <w:t xml:space="preserve">10</w:t>
+              <w:t xml:space="preserve">Top 5</w:t>
+            </w:r>
+          </w:p>
+        </w:tc>
+        <w:tc>
+          <w:tcPr/>
+          <w:p>
+            <w:pPr>
+              <w:pStyle w:val="Compact"/>
+            </w:pPr>
+            <w:r>
+              <w:t xml:space="preserve">5</w:t>
             </w:r>
           </w:p>
         </w:tc>
@@ -4994,7 +5481,7 @@
               <w:t xml:space="preserve">使用前</w:t>
             </w:r>
             <w:r>
-              <w:t xml:space="preserve"> 10 </w:t>
+              <w:t xml:space="preserve"> 5 </w:t>
             </w:r>
             <w:r>
               <w:rPr>
@@ -5013,6 +5500,147 @@
               <w:pStyle w:val="Compact"/>
             </w:pPr>
             <w:r>
+              <w:t xml:space="preserve">Top 10</w:t>
+            </w:r>
+          </w:p>
+        </w:tc>
+        <w:tc>
+          <w:tcPr/>
+          <w:p>
+            <w:pPr>
+              <w:pStyle w:val="Compact"/>
+            </w:pPr>
+            <w:r>
+              <w:t xml:space="preserve">10</w:t>
+            </w:r>
+          </w:p>
+        </w:tc>
+        <w:tc>
+          <w:tcPr/>
+          <w:p>
+            <w:pPr>
+              <w:pStyle w:val="Compact"/>
+            </w:pPr>
+            <w:r>
+              <w:rPr>
+                <w:rFonts w:hint="eastAsia"/>
+              </w:rPr>
+              <w:t xml:space="preserve">使用前</w:t>
+            </w:r>
+            <w:r>
+              <w:t xml:space="preserve"> 10 </w:t>
+            </w:r>
+            <w:r>
+              <w:rPr>
+                <w:rFonts w:hint="eastAsia"/>
+              </w:rPr>
+              <w:t xml:space="preserve">個重要特徵</w:t>
+            </w:r>
+          </w:p>
+        </w:tc>
+      </w:tr>
+      <w:tr>
+        <w:tc>
+          <w:tcPr/>
+          <w:p>
+            <w:pPr>
+              <w:pStyle w:val="Compact"/>
+            </w:pPr>
+            <w:r>
+              <w:t xml:space="preserve">Top 15</w:t>
+            </w:r>
+          </w:p>
+        </w:tc>
+        <w:tc>
+          <w:tcPr/>
+          <w:p>
+            <w:pPr>
+              <w:pStyle w:val="Compact"/>
+            </w:pPr>
+            <w:r>
+              <w:t xml:space="preserve">15</w:t>
+            </w:r>
+          </w:p>
+        </w:tc>
+        <w:tc>
+          <w:tcPr/>
+          <w:p>
+            <w:pPr>
+              <w:pStyle w:val="Compact"/>
+            </w:pPr>
+            <w:r>
+              <w:rPr>
+                <w:rFonts w:hint="eastAsia"/>
+              </w:rPr>
+              <w:t xml:space="preserve">使用前</w:t>
+            </w:r>
+            <w:r>
+              <w:t xml:space="preserve"> 15 </w:t>
+            </w:r>
+            <w:r>
+              <w:rPr>
+                <w:rFonts w:hint="eastAsia"/>
+              </w:rPr>
+              <w:t xml:space="preserve">個重要特徵</w:t>
+            </w:r>
+          </w:p>
+        </w:tc>
+      </w:tr>
+      <w:tr>
+        <w:tc>
+          <w:tcPr/>
+          <w:p>
+            <w:pPr>
+              <w:pStyle w:val="Compact"/>
+            </w:pPr>
+            <w:r>
+              <w:t xml:space="preserve">Top 20</w:t>
+            </w:r>
+          </w:p>
+        </w:tc>
+        <w:tc>
+          <w:tcPr/>
+          <w:p>
+            <w:pPr>
+              <w:pStyle w:val="Compact"/>
+            </w:pPr>
+            <w:r>
+              <w:t xml:space="preserve">20</w:t>
+            </w:r>
+          </w:p>
+        </w:tc>
+        <w:tc>
+          <w:tcPr/>
+          <w:p>
+            <w:pPr>
+              <w:pStyle w:val="Compact"/>
+            </w:pPr>
+            <w:r>
+              <w:rPr>
+                <w:rFonts w:hint="eastAsia"/>
+              </w:rPr>
+              <w:t xml:space="preserve">使用前</w:t>
+            </w:r>
+            <w:r>
+              <w:t xml:space="preserve"> 20 </w:t>
+            </w:r>
+            <w:r>
+              <w:rPr>
+                <w:rFonts w:hint="eastAsia"/>
+              </w:rPr>
+              <w:t xml:space="preserve">個重要特徵</w:t>
+            </w:r>
+          </w:p>
+        </w:tc>
+      </w:tr>
+      <w:tr>
+        <w:tc>
+          <w:tcPr/>
+          <w:p>
+            <w:pPr>
+              <w:pStyle w:val="Compact"/>
+            </w:pPr>
+            <w:r>
               <w:t xml:space="preserve">All</w:t>
             </w:r>
           </w:p>
@@ -5052,16 +5680,7 @@
         <w:rPr>
           <w:rFonts w:hint="eastAsia"/>
         </w:rPr>
-        <w:t xml:space="preserve">各疾病的</w:t>
-      </w:r>
-      <w:r>
-        <w:t xml:space="preserve"> Top 5 </w:t>
-      </w:r>
-      <w:r>
-        <w:rPr>
-          <w:rFonts w:hint="eastAsia"/>
-        </w:rPr>
-        <w:t xml:space="preserve">特徵由</w:t>
+        <w:t xml:space="preserve">各疾病的特徵排序由</w:t>
       </w:r>
       <w:r>
         <w:t xml:space="preserve"> SHAP </w:t>
@@ -5523,97 +6142,43 @@
         <w:t xml:space="preserve">：</w:t>
       </w:r>
     </w:p>
-    <w:p>
-      <w:pPr>
-        <w:pStyle w:val="a0"/>
-      </w:pPr>
-      <m:oMathPara>
-        <m:oMathParaPr>
-          <m:jc m:val="center"/>
-        </m:oMathParaPr>
-        <m:oMath>
-          <m:sSub>
-            <m:e>
-              <m:r>
-                <m:t>w</m:t>
-              </m:r>
-            </m:e>
-            <m:sub>
-              <m:r>
-                <m:t>i</m:t>
-              </m:r>
-            </m:sub>
-          </m:sSub>
-          <m:r>
-            <m:rPr>
-              <m:sty m:val="p"/>
-            </m:rPr>
-            <m:t>=</m:t>
-          </m:r>
-          <m:f>
-            <m:fPr>
-              <m:type m:val="bar"/>
-            </m:fPr>
-            <m:num>
+    <w:tbl>
+      <w:tblPr>
+        <w:tblStyle w:val="Table"/>
+        <w:tblW w:type="auto" w:w="0"/>
+        <w:tblLook w:firstRow="0" w:lastRow="0" w:firstColumn="0" w:lastColumn="0" w:noHBand="0" w:noVBand="0" w:val="0000"/>
+      </w:tblPr>
+      <w:tblGrid>
+        <w:gridCol w:w="2640"/>
+        <w:gridCol w:w="2640"/>
+        <w:gridCol w:w="2640"/>
+      </w:tblGrid>
+      <w:tr>
+        <w:tc>
+          <w:tcPr/>
+          <w:p>
+            <w:pPr>
+              <w:pStyle w:val="Compact"/>
+            </w:pPr>
+          </w:p>
+        </w:tc>
+        <w:tc>
+          <w:tcPr/>
+          <w:p>
+            <w:pPr>
+              <w:pStyle w:val="Compact"/>
+              <w:jc w:val="center"/>
+            </w:pPr>
+            <m:oMath>
               <m:sSub>
                 <m:e>
                   <m:r>
-                    <m:t>n</m:t>
+                    <m:t>w</m:t>
                   </m:r>
                 </m:e>
                 <m:sub>
                   <m:r>
-                    <m:t>s</m:t>
-                  </m:r>
-                  <m:r>
-                    <m:t>a</m:t>
-                  </m:r>
-                  <m:r>
-                    <m:t>m</m:t>
-                  </m:r>
-                  <m:r>
-                    <m:t>p</m:t>
-                  </m:r>
-                  <m:r>
-                    <m:t>l</m:t>
-                  </m:r>
-                  <m:r>
-                    <m:t>e</m:t>
-                  </m:r>
-                  <m:r>
-                    <m:t>s</m:t>
-                  </m:r>
-                </m:sub>
-              </m:sSub>
-            </m:num>
-            <m:den>
-              <m:sSub>
-                <m:e>
-                  <m:r>
-                    <m:t>n</m:t>
-                  </m:r>
-                </m:e>
-                <m:sub>
-                  <m:r>
-                    <m:t>c</m:t>
-                  </m:r>
-                  <m:r>
-                    <m:t>l</m:t>
-                  </m:r>
-                  <m:r>
-                    <m:t>a</m:t>
-                  </m:r>
-                  <m:r>
-                    <m:t>s</m:t>
-                  </m:r>
-                  <m:r>
-                    <m:t>s</m:t>
-                  </m:r>
-                  <m:r>
-                    <m:t>e</m:t>
-                  </m:r>
-                  <m:r>
-                    <m:t>s</m:t>
+                    <m:t>i</m:t>
                   </m:r>
                 </m:sub>
               </m:sSub>
@@ -5621,55 +6186,142 @@
                 <m:rPr>
                   <m:sty m:val="p"/>
                 </m:rPr>
-                <m:t>×</m:t>
+                <m:t>=</m:t>
               </m:r>
-              <m:sSub>
-                <m:e>
+              <m:f>
+                <m:fPr>
+                  <m:type m:val="bar"/>
+                </m:fPr>
+                <m:num>
+                  <m:sSub>
+                    <m:e>
+                      <m:r>
+                        <m:t>n</m:t>
+                      </m:r>
+                    </m:e>
+                    <m:sub>
+                      <m:r>
+                        <m:t>s</m:t>
+                      </m:r>
+                      <m:r>
+                        <m:t>a</m:t>
+                      </m:r>
+                      <m:r>
+                        <m:t>m</m:t>
+                      </m:r>
+                      <m:r>
+                        <m:t>p</m:t>
+                      </m:r>
+                      <m:r>
+                        <m:t>l</m:t>
+                      </m:r>
+                      <m:r>
+                        <m:t>e</m:t>
+                      </m:r>
+                      <m:r>
+                        <m:t>s</m:t>
+                      </m:r>
+                    </m:sub>
+                  </m:sSub>
+                </m:num>
+                <m:den>
+                  <m:sSub>
+                    <m:e>
+                      <m:r>
+                        <m:t>n</m:t>
+                      </m:r>
+                    </m:e>
+                    <m:sub>
+                      <m:r>
+                        <m:t>c</m:t>
+                      </m:r>
+                      <m:r>
+                        <m:t>l</m:t>
+                      </m:r>
+                      <m:r>
+                        <m:t>a</m:t>
+                      </m:r>
+                      <m:r>
+                        <m:t>s</m:t>
+                      </m:r>
+                      <m:r>
+                        <m:t>s</m:t>
+                      </m:r>
+                      <m:r>
+                        <m:t>e</m:t>
+                      </m:r>
+                      <m:r>
+                        <m:t>s</m:t>
+                      </m:r>
+                    </m:sub>
+                  </m:sSub>
                   <m:r>
-                    <m:t>n</m:t>
-                  </m:r>
-                </m:e>
-                <m:sub>
-                  <m:r>
-                    <m:t>s</m:t>
-                  </m:r>
-                  <m:r>
-                    <m:t>a</m:t>
-                  </m:r>
-                  <m:r>
-                    <m:t>m</m:t>
-                  </m:r>
-                  <m:r>
-                    <m:t>p</m:t>
-                  </m:r>
-                  <m:r>
-                    <m:t>l</m:t>
-                  </m:r>
-                  <m:r>
-                    <m:t>e</m:t>
+                    <m:rPr>
+                      <m:sty m:val="p"/>
+                    </m:rPr>
+                    <m:t>×</m:t>
                   </m:r>
                   <m:sSub>
                     <m:e>
                       <m:r>
-                        <m:t>s</m:t>
+                        <m:t>n</m:t>
                       </m:r>
                     </m:e>
                     <m:sub>
                       <m:r>
-                        <m:t>i</m:t>
+                        <m:t>s</m:t>
                       </m:r>
+                      <m:r>
+                        <m:t>a</m:t>
+                      </m:r>
+                      <m:r>
+                        <m:t>m</m:t>
+                      </m:r>
+                      <m:r>
+                        <m:t>p</m:t>
+                      </m:r>
+                      <m:r>
+                        <m:t>l</m:t>
+                      </m:r>
+                      <m:r>
+                        <m:t>e</m:t>
+                      </m:r>
+                      <m:sSub>
+                        <m:e>
+                          <m:r>
+                            <m:t>s</m:t>
+                          </m:r>
+                        </m:e>
+                        <m:sub>
+                          <m:r>
+                            <m:t>i</m:t>
+                          </m:r>
+                        </m:sub>
+                      </m:sSub>
                     </m:sub>
                   </m:sSub>
-                </m:sub>
-              </m:sSub>
-            </m:den>
-          </m:f>
-        </m:oMath>
-      </m:oMathPara>
-    </w:p>
-    <w:p>
-      <w:pPr>
-        <w:pStyle w:val="FirstParagraph"/>
+                </m:den>
+              </m:f>
+            </m:oMath>
+          </w:p>
+        </w:tc>
+        <w:tc>
+          <w:tcPr/>
+          <w:p>
+            <w:pPr>
+              <w:pStyle w:val="Compact"/>
+              <w:jc w:val="right"/>
+            </w:pPr>
+            <w:r>
+              <w:t xml:space="preserve">(4-5)</w:t>
+            </w:r>
+          </w:p>
+        </w:tc>
+      </w:tr>
+    </w:tbl>
+    <w:p>
+      <w:pPr>
+        <w:pStyle w:val="a0"/>
       </w:pPr>
       <w:r>
         <w:rPr>

</xml_diff>